<commit_message>
[docs](main): 20+34주차 작업일지 업로드
</commit_message>
<xml_diff>
--- a/작업일지/졸업작품 작업일지 - 20+34주차.docx
+++ b/작업일지/졸업작품 작업일지 - 20+34주차.docx
@@ -179,6 +179,7 @@
                 <w:sz w:val="22"/>
               </w:rPr>
             </w:pPr>
+            <w:proofErr w:type="spellStart"/>
             <w:r>
               <w:rPr>
                 <w:rFonts w:hint="eastAsia"/>
@@ -187,6 +188,7 @@
               </w:rPr>
               <w:t>팀명</w:t>
             </w:r>
+            <w:proofErr w:type="spellEnd"/>
           </w:p>
         </w:tc>
         <w:tc>
@@ -451,14 +453,46 @@
                 <w:rFonts w:hint="eastAsia"/>
                 <w:b/>
               </w:rPr>
-              <w:t xml:space="preserve">장명운: </w:t>
-            </w:r>
-            <w:r>
-              <w:rPr>
-                <w:rFonts w:hint="eastAsia"/>
-                <w:b/>
-              </w:rPr>
-              <w:t>맵에 나무 및 프랍 배치, 스킬 스크립트 제작</w:t>
+              <w:t>장명운:</w:t>
+            </w:r>
+            <w:r>
+              <w:rPr>
+                <w:rFonts w:hint="eastAsia"/>
+                <w:b/>
+              </w:rPr>
+              <w:t xml:space="preserve"> IBL 구현, </w:t>
+            </w:r>
+            <w:proofErr w:type="spellStart"/>
+            <w:r>
+              <w:rPr>
+                <w:rFonts w:hint="eastAsia"/>
+                <w:b/>
+              </w:rPr>
+              <w:t>프랍</w:t>
+            </w:r>
+            <w:proofErr w:type="spellEnd"/>
+            <w:r>
+              <w:rPr>
+                <w:rFonts w:hint="eastAsia"/>
+                <w:b/>
+              </w:rPr>
+              <w:t xml:space="preserve">-캐릭터 충돌 처리 구현, prop에 대해서 </w:t>
+            </w:r>
+            <w:proofErr w:type="spellStart"/>
+            <w:r>
+              <w:rPr>
+                <w:rFonts w:hint="eastAsia"/>
+                <w:b/>
+              </w:rPr>
+              <w:t>컬링</w:t>
+            </w:r>
+            <w:proofErr w:type="spellEnd"/>
+            <w:r>
+              <w:rPr>
+                <w:rFonts w:hint="eastAsia"/>
+                <w:b/>
+              </w:rPr>
+              <w:t xml:space="preserve"> 구현, 스킬 충전 시스템 구현, 애니메이션 스케줄링 로직 최적화, 각종 렌더링 버그 수정, 몬스터 추가 테스트</w:t>
             </w:r>
           </w:p>
           <w:p>
@@ -482,12 +516,21 @@
               </w:rPr>
               <w:t xml:space="preserve"> NPC </w:t>
             </w:r>
-            <w:r>
-              <w:rPr>
-                <w:rFonts w:hint="eastAsia"/>
-                <w:b/>
-              </w:rPr>
-              <w:t>분리력 계산 최적화,</w:t>
+            <w:proofErr w:type="spellStart"/>
+            <w:r>
+              <w:rPr>
+                <w:rFonts w:hint="eastAsia"/>
+                <w:b/>
+              </w:rPr>
+              <w:t>분리력</w:t>
+            </w:r>
+            <w:proofErr w:type="spellEnd"/>
+            <w:r>
+              <w:rPr>
+                <w:rFonts w:hint="eastAsia"/>
+                <w:b/>
+              </w:rPr>
+              <w:t xml:space="preserve"> 계산 최적화,</w:t>
             </w:r>
             <w:r>
               <w:rPr>
@@ -514,9 +557,6 @@
           <w:p>
             <w:pPr>
               <w:jc w:val="left"/>
-              <w:rPr>
-                <w:rFonts w:hint="eastAsia"/>
-              </w:rPr>
             </w:pPr>
             <w:r>
               <w:rPr>
@@ -608,7 +648,7 @@
           <w:rFonts w:hint="eastAsia"/>
           <w:sz w:val="22"/>
         </w:rPr>
-        <w:t>맵에 나무 및 프랍 배치</w:t>
+        <w:t>IBL 구현</w:t>
       </w:r>
     </w:p>
     <w:p>
@@ -624,12 +664,37 @@
           <w:sz w:val="22"/>
         </w:rPr>
       </w:pPr>
-      <w:r>
-        <w:rPr>
-          <w:rFonts w:hint="eastAsia"/>
-          <w:sz w:val="22"/>
-        </w:rPr>
-        <w:t>Terrain Chunk에 브러쉬로 칠해서 만듦</w:t>
+      <w:proofErr w:type="spellStart"/>
+      <w:r>
+        <w:rPr>
+          <w:rFonts w:hint="eastAsia"/>
+          <w:sz w:val="22"/>
+        </w:rPr>
+        <w:t>GBuffer</w:t>
+      </w:r>
+      <w:proofErr w:type="spellEnd"/>
+      <w:r>
+        <w:rPr>
+          <w:rFonts w:hint="eastAsia"/>
+          <w:sz w:val="22"/>
+        </w:rPr>
+        <w:t xml:space="preserve"> Lighting Pass 이후 IBL </w:t>
+      </w:r>
+      <w:proofErr w:type="spellStart"/>
+      <w:r>
+        <w:rPr>
+          <w:rFonts w:hint="eastAsia"/>
+          <w:sz w:val="22"/>
+        </w:rPr>
+        <w:t>셰이딩</w:t>
+      </w:r>
+      <w:proofErr w:type="spellEnd"/>
+      <w:r>
+        <w:rPr>
+          <w:rFonts w:hint="eastAsia"/>
+          <w:sz w:val="22"/>
+        </w:rPr>
+        <w:t xml:space="preserve"> 수행(skybox 기반 global irradiance만)</w:t>
       </w:r>
     </w:p>
     <w:p>
@@ -650,7 +715,28 @@
           <w:rFonts w:hint="eastAsia"/>
           <w:sz w:val="22"/>
         </w:rPr>
-        <w:t>Terrain의 Detail Layer를 읽어 Detail Mesh들의 배치(Transform, Ground Align)를 파악한 후 추출</w:t>
+        <w:t>이후 ACES tone mapping -&gt; bloom 후처리</w:t>
+      </w:r>
+    </w:p>
+    <w:p>
+      <w:pPr>
+        <w:pStyle w:val="a3"/>
+        <w:numPr>
+          <w:ilvl w:val="2"/>
+          <w:numId w:val="1"/>
+        </w:numPr>
+        <w:ind w:leftChars="0"/>
+        <w:jc w:val="left"/>
+        <w:rPr>
+          <w:sz w:val="22"/>
+        </w:rPr>
+      </w:pPr>
+      <w:r>
+        <w:rPr>
+          <w:rFonts w:hint="eastAsia"/>
+          <w:sz w:val="22"/>
+        </w:rPr>
+        <w:t>기존 Reinhard tone mapping은 제거(ACES로 교체, 뿌연 색감 문제)</w:t>
       </w:r>
     </w:p>
     <w:p>
@@ -671,7 +757,161 @@
           <w:rFonts w:hint="eastAsia"/>
           <w:sz w:val="22"/>
         </w:rPr>
-        <w:t>임포트된 나무와 프랍은 Chunk 내부에 Static Object로 담겨 물리와 렌더링 처리</w:t>
+        <w:t>기존 global ambient 상수 적용 제거(IBL이 ambient 자리를 대신)</w:t>
+      </w:r>
+    </w:p>
+    <w:p>
+      <w:pPr>
+        <w:ind w:left="800"/>
+        <w:jc w:val="left"/>
+        <w:rPr>
+          <w:sz w:val="22"/>
+        </w:rPr>
+      </w:pPr>
+      <w:r>
+        <w:rPr>
+          <w:rFonts w:hint="eastAsia"/>
+          <w:noProof/>
+          <w:sz w:val="22"/>
+        </w:rPr>
+        <w:drawing>
+          <wp:inline distT="0" distB="0" distL="0" distR="0" wp14:anchorId="1D73D0BB" wp14:editId="7F1B4FA0">
+            <wp:extent cx="4797250" cy="3600000"/>
+            <wp:effectExtent l="0" t="0" r="3810" b="635"/>
+            <wp:docPr id="2100667479" name="그림 1"/>
+            <wp:cNvGraphicFramePr>
+              <a:graphicFrameLocks xmlns:a="http://schemas.openxmlformats.org/drawingml/2006/main" noChangeAspect="1"/>
+            </wp:cNvGraphicFramePr>
+            <a:graphic xmlns:a="http://schemas.openxmlformats.org/drawingml/2006/main">
+              <a:graphicData uri="http://schemas.openxmlformats.org/drawingml/2006/picture">
+                <pic:pic xmlns:pic="http://schemas.openxmlformats.org/drawingml/2006/picture">
+                  <pic:nvPicPr>
+                    <pic:cNvPr id="2100667479" name="그림 2100667479"/>
+                    <pic:cNvPicPr/>
+                  </pic:nvPicPr>
+                  <pic:blipFill>
+                    <a:blip r:embed="rId7">
+                      <a:extLst>
+                        <a:ext uri="{28A0092B-C50C-407E-A947-70E740481C1C}">
+                          <a14:useLocalDpi xmlns:a14="http://schemas.microsoft.com/office/drawing/2010/main" val="0"/>
+                        </a:ext>
+                      </a:extLst>
+                    </a:blip>
+                    <a:stretch>
+                      <a:fillRect/>
+                    </a:stretch>
+                  </pic:blipFill>
+                  <pic:spPr>
+                    <a:xfrm>
+                      <a:off x="0" y="0"/>
+                      <a:ext cx="4797250" cy="3600000"/>
+                    </a:xfrm>
+                    <a:prstGeom prst="rect">
+                      <a:avLst/>
+                    </a:prstGeom>
+                  </pic:spPr>
+                </pic:pic>
+              </a:graphicData>
+            </a:graphic>
+          </wp:inline>
+        </w:drawing>
+      </w:r>
+    </w:p>
+    <w:p>
+      <w:pPr>
+        <w:pStyle w:val="a3"/>
+        <w:numPr>
+          <w:ilvl w:val="0"/>
+          <w:numId w:val="1"/>
+        </w:numPr>
+        <w:ind w:leftChars="0"/>
+        <w:jc w:val="left"/>
+        <w:rPr>
+          <w:sz w:val="22"/>
+        </w:rPr>
+      </w:pPr>
+      <w:proofErr w:type="spellStart"/>
+      <w:r>
+        <w:rPr>
+          <w:rFonts w:hint="eastAsia"/>
+          <w:sz w:val="22"/>
+        </w:rPr>
+        <w:t>프랍</w:t>
+      </w:r>
+      <w:proofErr w:type="spellEnd"/>
+      <w:r>
+        <w:rPr>
+          <w:rFonts w:hint="eastAsia"/>
+          <w:sz w:val="22"/>
+        </w:rPr>
+        <w:t>-캐릭터 충돌 처리 구현</w:t>
+      </w:r>
+    </w:p>
+    <w:p>
+      <w:pPr>
+        <w:pStyle w:val="a3"/>
+        <w:numPr>
+          <w:ilvl w:val="1"/>
+          <w:numId w:val="1"/>
+        </w:numPr>
+        <w:ind w:leftChars="0"/>
+        <w:jc w:val="left"/>
+        <w:rPr>
+          <w:sz w:val="22"/>
+        </w:rPr>
+      </w:pPr>
+      <w:r>
+        <w:rPr>
+          <w:rFonts w:hint="eastAsia"/>
+          <w:sz w:val="22"/>
+        </w:rPr>
+        <w:t xml:space="preserve">BVH가 있는 </w:t>
+      </w:r>
+      <w:proofErr w:type="spellStart"/>
+      <w:r>
+        <w:rPr>
+          <w:rFonts w:hint="eastAsia"/>
+          <w:sz w:val="22"/>
+        </w:rPr>
+        <w:t>프랍들의</w:t>
+      </w:r>
+      <w:proofErr w:type="spellEnd"/>
+      <w:r>
+        <w:rPr>
+          <w:rFonts w:hint="eastAsia"/>
+          <w:sz w:val="22"/>
+        </w:rPr>
+        <w:t xml:space="preserve"> 경우에만 충돌 처리(나무/바위)</w:t>
+      </w:r>
+    </w:p>
+    <w:p>
+      <w:pPr>
+        <w:pStyle w:val="a3"/>
+        <w:numPr>
+          <w:ilvl w:val="1"/>
+          <w:numId w:val="1"/>
+        </w:numPr>
+        <w:ind w:leftChars="0"/>
+        <w:jc w:val="left"/>
+        <w:rPr>
+          <w:sz w:val="22"/>
+        </w:rPr>
+      </w:pPr>
+      <w:proofErr w:type="spellStart"/>
+      <w:r>
+        <w:rPr>
+          <w:rFonts w:hint="eastAsia"/>
+          <w:sz w:val="22"/>
+        </w:rPr>
+        <w:t>프랍은</w:t>
+      </w:r>
+      <w:proofErr w:type="spellEnd"/>
+      <w:r>
+        <w:rPr>
+          <w:rFonts w:hint="eastAsia"/>
+          <w:sz w:val="22"/>
+        </w:rPr>
+        <w:t xml:space="preserve"> static이므로 간단하게 캐릭터 침투 해소만</w:t>
       </w:r>
     </w:p>
     <w:p>
@@ -692,20 +932,87 @@
           <w:rFonts w:hint="eastAsia"/>
           <w:sz w:val="22"/>
         </w:rPr>
-        <w:t>충돌 처리를 위해 리소스별 BVH 제작하였으나 하직 PhysicSystem에 등록하지 않아</w:t>
-      </w:r>
-      <w:r>
-        <w:rPr>
-          <w:sz w:val="22"/>
-        </w:rPr>
-        <w:br/>
-      </w:r>
-      <w:r>
-        <w:rPr>
-          <w:rFonts w:hint="eastAsia"/>
-          <w:sz w:val="22"/>
-        </w:rPr>
-        <w:t>충돌 처리는 불가 (나무와 바위 등 관통)</w:t>
+        <w:lastRenderedPageBreak/>
+        <w:t xml:space="preserve">플레이어는 </w:t>
+      </w:r>
+      <w:proofErr w:type="spellStart"/>
+      <w:r>
+        <w:rPr>
+          <w:rFonts w:hint="eastAsia"/>
+          <w:sz w:val="22"/>
+        </w:rPr>
+        <w:t>클라에서</w:t>
+      </w:r>
+      <w:proofErr w:type="spellEnd"/>
+      <w:r>
+        <w:rPr>
+          <w:rFonts w:hint="eastAsia"/>
+          <w:sz w:val="22"/>
+        </w:rPr>
+        <w:t>, 몬스터는 서버에서</w:t>
+      </w:r>
+    </w:p>
+    <w:p>
+      <w:pPr>
+        <w:pStyle w:val="a3"/>
+        <w:numPr>
+          <w:ilvl w:val="0"/>
+          <w:numId w:val="1"/>
+        </w:numPr>
+        <w:ind w:leftChars="0"/>
+        <w:jc w:val="left"/>
+        <w:rPr>
+          <w:sz w:val="22"/>
+        </w:rPr>
+      </w:pPr>
+      <w:r>
+        <w:rPr>
+          <w:rFonts w:hint="eastAsia"/>
+          <w:sz w:val="22"/>
+        </w:rPr>
+        <w:t>스킬 충전 시스템 구현</w:t>
+      </w:r>
+    </w:p>
+    <w:p>
+      <w:pPr>
+        <w:pStyle w:val="a3"/>
+        <w:numPr>
+          <w:ilvl w:val="1"/>
+          <w:numId w:val="1"/>
+        </w:numPr>
+        <w:ind w:leftChars="0"/>
+        <w:jc w:val="left"/>
+        <w:rPr>
+          <w:sz w:val="22"/>
+        </w:rPr>
+      </w:pPr>
+      <w:r>
+        <w:rPr>
+          <w:rFonts w:hint="eastAsia"/>
+          <w:sz w:val="22"/>
+        </w:rPr>
+        <w:t>마우스 휠 업/다운으로 스킬 선택, 휠 클릭으로 스킬 사용</w:t>
+      </w:r>
+    </w:p>
+    <w:p>
+      <w:pPr>
+        <w:pStyle w:val="a3"/>
+        <w:numPr>
+          <w:ilvl w:val="1"/>
+          <w:numId w:val="1"/>
+        </w:numPr>
+        <w:ind w:leftChars="0"/>
+        <w:jc w:val="left"/>
+        <w:rPr>
+          <w:sz w:val="22"/>
+        </w:rPr>
+      </w:pPr>
+      <w:r>
+        <w:rPr>
+          <w:rFonts w:hint="eastAsia"/>
+          <w:sz w:val="22"/>
+        </w:rPr>
+        <w:t>적 처치 시 충전 포인트 획득, 카트라이더 부스터처럼 포인트가 다 차면 시전 가능</w:t>
       </w:r>
     </w:p>
     <w:p>
@@ -726,20 +1033,49 @@
           <w:rFonts w:hint="eastAsia"/>
           <w:sz w:val="22"/>
         </w:rPr>
-        <w:t>나뭇잎, 풀 등의 객체를 대상으로 셰이더에서 alpha-test 수행하기 위해</w:t>
-      </w:r>
-      <w:r>
-        <w:rPr>
-          <w:sz w:val="22"/>
-        </w:rPr>
-        <w:br/>
-      </w:r>
-      <w:r>
-        <w:rPr>
-          <w:rFonts w:hint="eastAsia"/>
-          <w:sz w:val="22"/>
-        </w:rPr>
-        <w:t>대상 Material 구조체에 cAlphaCutoff 추가</w:t>
+        <w:t>15초 이내에 데미지를 입힌 적이 죽었을 경우 그 몬스터에 지정된 만큼의 충전 포인트를 획득하는 방식</w:t>
+      </w:r>
+    </w:p>
+    <w:p>
+      <w:pPr>
+        <w:pStyle w:val="a3"/>
+        <w:numPr>
+          <w:ilvl w:val="2"/>
+          <w:numId w:val="1"/>
+        </w:numPr>
+        <w:ind w:leftChars="0"/>
+        <w:jc w:val="left"/>
+        <w:rPr>
+          <w:sz w:val="22"/>
+        </w:rPr>
+      </w:pPr>
+      <w:r>
+        <w:rPr>
+          <w:rFonts w:hint="eastAsia"/>
+          <w:sz w:val="22"/>
+        </w:rPr>
+        <w:t>스킬별 충전 포인트 별도 설정</w:t>
+      </w:r>
+    </w:p>
+    <w:p>
+      <w:pPr>
+        <w:pStyle w:val="a3"/>
+        <w:numPr>
+          <w:ilvl w:val="0"/>
+          <w:numId w:val="1"/>
+        </w:numPr>
+        <w:ind w:leftChars="0"/>
+        <w:jc w:val="left"/>
+        <w:rPr>
+          <w:sz w:val="22"/>
+        </w:rPr>
+      </w:pPr>
+      <w:r>
+        <w:rPr>
+          <w:rFonts w:hint="eastAsia"/>
+          <w:sz w:val="22"/>
+        </w:rPr>
+        <w:t>애니메이션 스케줄링 로직 최적화</w:t>
       </w:r>
     </w:p>
     <w:p>
@@ -760,7 +1096,60 @@
           <w:rFonts w:hint="eastAsia"/>
           <w:sz w:val="22"/>
         </w:rPr>
-        <w:t>나뭇잎 색깔이 너무 어두운 경향이 있음, 셰이딩 버그인지 확인해야 함</w:t>
+        <w:t xml:space="preserve">now() 호출이 병목, 경과 시간을 </w:t>
+      </w:r>
+      <w:proofErr w:type="spellStart"/>
+      <w:r>
+        <w:rPr>
+          <w:rFonts w:hint="eastAsia"/>
+          <w:sz w:val="22"/>
+        </w:rPr>
+        <w:t>jobSize</w:t>
+      </w:r>
+      <w:proofErr w:type="spellEnd"/>
+      <w:r>
+        <w:rPr>
+          <w:rFonts w:hint="eastAsia"/>
+          <w:sz w:val="22"/>
+        </w:rPr>
+        <w:t xml:space="preserve">만큼의 애니메이션을 처리했을 때 검사하도록 수정, </w:t>
+      </w:r>
+      <w:proofErr w:type="spellStart"/>
+      <w:r>
+        <w:rPr>
+          <w:rFonts w:hint="eastAsia"/>
+          <w:sz w:val="22"/>
+        </w:rPr>
+        <w:t>jobSize</w:t>
+      </w:r>
+      <w:proofErr w:type="spellEnd"/>
+      <w:r>
+        <w:rPr>
+          <w:rFonts w:hint="eastAsia"/>
+          <w:sz w:val="22"/>
+        </w:rPr>
+        <w:t>는 애니메이션 스케줄러에 배정된 time slice를 기준치 이상 초과하거나 미달하면 0.85배/1.15배되어 조절됨</w:t>
+      </w:r>
+    </w:p>
+    <w:p>
+      <w:pPr>
+        <w:pStyle w:val="a3"/>
+        <w:numPr>
+          <w:ilvl w:val="0"/>
+          <w:numId w:val="1"/>
+        </w:numPr>
+        <w:ind w:leftChars="0"/>
+        <w:jc w:val="left"/>
+        <w:rPr>
+          <w:sz w:val="22"/>
+        </w:rPr>
+      </w:pPr>
+      <w:r>
+        <w:rPr>
+          <w:rFonts w:hint="eastAsia"/>
+          <w:sz w:val="22"/>
+        </w:rPr>
+        <w:t>각종 렌더링 버그 수정</w:t>
       </w:r>
     </w:p>
     <w:p>
@@ -778,36 +1167,85 @@
       </w:pPr>
       <w:r>
         <w:rPr>
-          <w:rFonts w:hint="eastAsia"/>
-          <w:sz w:val="22"/>
-        </w:rPr>
-        <w:t>현재 나무와 프랍들을 모두 합하면 청크당 약 20,000 개의 인스턴스가 존재함,</w:t>
-      </w:r>
-      <w:r>
-        <w:rPr>
-          <w:sz w:val="22"/>
-        </w:rPr>
-        <w:br/>
-      </w:r>
-      <w:r>
-        <w:rPr>
-          <w:rFonts w:hint="eastAsia"/>
-          <w:sz w:val="22"/>
-        </w:rPr>
-        <w:t>기존의 컬링 기법들, deferred rendering, h/w instancing과 맞물려 FPS에 영향이 거의</w:t>
-      </w:r>
-      <w:r>
-        <w:rPr>
-          <w:sz w:val="22"/>
-        </w:rPr>
-        <w:br/>
-      </w:r>
-      <w:r>
-        <w:rPr>
-          <w:rFonts w:hint="eastAsia"/>
-          <w:sz w:val="22"/>
-        </w:rPr>
-        <w:t>없었음</w:t>
+          <w:sz w:val="22"/>
+        </w:rPr>
+        <w:t>A</w:t>
+      </w:r>
+      <w:r>
+        <w:rPr>
+          <w:rFonts w:hint="eastAsia"/>
+          <w:sz w:val="22"/>
+        </w:rPr>
+        <w:t>lpha test를 통해 그려지는 나뭇잎, 풀 등에 대해 그림자가 사각형인 버그 수정</w:t>
+      </w:r>
+    </w:p>
+    <w:p>
+      <w:pPr>
+        <w:pStyle w:val="a3"/>
+        <w:numPr>
+          <w:ilvl w:val="2"/>
+          <w:numId w:val="1"/>
+        </w:numPr>
+        <w:ind w:leftChars="0"/>
+        <w:jc w:val="left"/>
+        <w:rPr>
+          <w:sz w:val="22"/>
+        </w:rPr>
+      </w:pPr>
+      <w:r>
+        <w:rPr>
+          <w:rFonts w:hint="eastAsia"/>
+          <w:sz w:val="22"/>
+        </w:rPr>
+        <w:t>해당 종류의 오브젝트들만 모아 masked CSM 구현</w:t>
+      </w:r>
+    </w:p>
+    <w:p>
+      <w:pPr>
+        <w:pStyle w:val="a3"/>
+        <w:numPr>
+          <w:ilvl w:val="1"/>
+          <w:numId w:val="1"/>
+        </w:numPr>
+        <w:ind w:leftChars="0"/>
+        <w:jc w:val="left"/>
+        <w:rPr>
+          <w:sz w:val="22"/>
+        </w:rPr>
+      </w:pPr>
+      <w:r>
+        <w:rPr>
+          <w:rFonts w:hint="eastAsia"/>
+          <w:sz w:val="22"/>
+        </w:rPr>
+        <w:t>검은 사각형이 간헐적으로 나오는 문제 수정</w:t>
+      </w:r>
+    </w:p>
+    <w:p>
+      <w:pPr>
+        <w:pStyle w:val="a3"/>
+        <w:numPr>
+          <w:ilvl w:val="2"/>
+          <w:numId w:val="1"/>
+        </w:numPr>
+        <w:ind w:leftChars="0"/>
+        <w:jc w:val="left"/>
+        <w:rPr>
+          <w:sz w:val="22"/>
+        </w:rPr>
+      </w:pPr>
+      <w:r>
+        <w:rPr>
+          <w:sz w:val="22"/>
+        </w:rPr>
+        <w:t>B</w:t>
+      </w:r>
+      <w:r>
+        <w:rPr>
+          <w:rFonts w:hint="eastAsia"/>
+          <w:sz w:val="22"/>
+        </w:rPr>
+        <w:t>loom 계산 중 NAN 발생 문제 (division by zero)</w:t>
       </w:r>
     </w:p>
     <w:p>
@@ -828,7 +1266,7 @@
           <w:rFonts w:hint="eastAsia"/>
           <w:sz w:val="22"/>
         </w:rPr>
-        <w:t>스킬 스크립트 제작</w:t>
+        <w:t>몬스터 추가 테스트</w:t>
       </w:r>
     </w:p>
     <w:p>
@@ -849,14 +1287,14 @@
           <w:rFonts w:hint="eastAsia"/>
           <w:sz w:val="22"/>
         </w:rPr>
-        <w:t>클라이언트 standalone 스킬 모드를 완전히 스킬 에디터 툴로 변경</w:t>
+        <w:t>뱀, 버섯 몬스터 추가</w:t>
       </w:r>
     </w:p>
     <w:p>
       <w:pPr>
         <w:pStyle w:val="a3"/>
         <w:numPr>
-          <w:ilvl w:val="2"/>
+          <w:ilvl w:val="1"/>
           <w:numId w:val="1"/>
         </w:numPr>
         <w:ind w:leftChars="0"/>
@@ -870,14 +1308,14 @@
           <w:rFonts w:hint="eastAsia"/>
           <w:sz w:val="22"/>
         </w:rPr>
-        <w:t>GUI로 특정 스킬 플레이 및 편집 가능</w:t>
+        <w:t>유니티에서 조절한 크기가 반영이 되지 않고 있음</w:t>
       </w:r>
     </w:p>
     <w:p>
       <w:pPr>
         <w:pStyle w:val="a3"/>
         <w:numPr>
-          <w:ilvl w:val="2"/>
+          <w:ilvl w:val="0"/>
           <w:numId w:val="1"/>
         </w:numPr>
         <w:ind w:leftChars="0"/>
@@ -888,580 +1326,6 @@
       </w:pPr>
       <w:r>
         <w:rPr>
-          <w:rFonts w:hint="eastAsia"/>
-          <w:sz w:val="22"/>
-        </w:rPr>
-        <w:t>스킬의 히트박스를 클릭하면 마우스 피킹을 통해 선택되고,</w:t>
-      </w:r>
-      <w:r>
-        <w:rPr>
-          <w:sz w:val="22"/>
-        </w:rPr>
-        <w:br/>
-      </w:r>
-      <w:r>
-        <w:rPr>
-          <w:rFonts w:hint="eastAsia"/>
-          <w:sz w:val="22"/>
-        </w:rPr>
-        <w:t>생성 시점/소멸 시점/변환/부착 대상/히트 이벤트 등을 미세 조정할 수 있음</w:t>
-      </w:r>
-    </w:p>
-    <w:p>
-      <w:pPr>
-        <w:pStyle w:val="a3"/>
-        <w:numPr>
-          <w:ilvl w:val="2"/>
-          <w:numId w:val="1"/>
-        </w:numPr>
-        <w:ind w:leftChars="0"/>
-        <w:jc w:val="left"/>
-        <w:rPr>
-          <w:sz w:val="22"/>
-        </w:rPr>
-      </w:pPr>
-      <w:r>
-        <w:rPr>
-          <w:sz w:val="22"/>
-        </w:rPr>
-        <w:t>C</w:t>
-      </w:r>
-      <w:r>
-        <w:rPr>
-          <w:rFonts w:hint="eastAsia"/>
-          <w:sz w:val="22"/>
-        </w:rPr>
-        <w:t>onfirm 시 조정된 값들을 스크립트에 덮어쓰기하여 반영</w:t>
-      </w:r>
-    </w:p>
-    <w:p>
-      <w:pPr>
-        <w:widowControl/>
-        <w:wordWrap/>
-        <w:autoSpaceDE/>
-        <w:autoSpaceDN/>
-        <w:rPr>
-          <w:sz w:val="22"/>
-        </w:rPr>
-      </w:pPr>
-      <w:r>
-        <w:rPr>
-          <w:sz w:val="22"/>
-        </w:rPr>
-        <w:br w:type="page"/>
-      </w:r>
-    </w:p>
-    <w:p>
-      <w:pPr>
-        <w:pStyle w:val="a3"/>
-        <w:numPr>
-          <w:ilvl w:val="1"/>
-          <w:numId w:val="1"/>
-        </w:numPr>
-        <w:ind w:leftChars="0"/>
-        <w:jc w:val="left"/>
-        <w:rPr>
-          <w:sz w:val="22"/>
-        </w:rPr>
-      </w:pPr>
-      <w:r>
-        <w:rPr>
-          <w:rFonts w:hint="eastAsia"/>
-          <w:sz w:val="22"/>
-        </w:rPr>
-        <w:lastRenderedPageBreak/>
-        <w:t>지면과 연계되는 스킬 구현</w:t>
-      </w:r>
-    </w:p>
-    <w:p>
-      <w:pPr>
-        <w:pStyle w:val="a3"/>
-        <w:numPr>
-          <w:ilvl w:val="2"/>
-          <w:numId w:val="1"/>
-        </w:numPr>
-        <w:ind w:leftChars="0"/>
-        <w:jc w:val="left"/>
-        <w:rPr>
-          <w:sz w:val="22"/>
-        </w:rPr>
-      </w:pPr>
-      <w:r>
-        <w:rPr>
-          <w:rFonts w:hint="eastAsia"/>
-          <w:sz w:val="22"/>
-        </w:rPr>
-        <w:t>땅에서 얼음 기둥이 솟아나는 스킬, 마법 구가 땅에 부딪혀 폭발하는 스킬 등</w:t>
-      </w:r>
-      <w:r>
-        <w:rPr>
-          <w:sz w:val="22"/>
-        </w:rPr>
-        <w:br/>
-      </w:r>
-      <w:r>
-        <w:rPr>
-          <w:rFonts w:hint="eastAsia"/>
-          <w:sz w:val="22"/>
-        </w:rPr>
-        <w:t>지면과의 상호작용이 필요한 스킬들이 있음</w:t>
-      </w:r>
-    </w:p>
-    <w:p>
-      <w:pPr>
-        <w:pStyle w:val="a3"/>
-        <w:numPr>
-          <w:ilvl w:val="2"/>
-          <w:numId w:val="1"/>
-        </w:numPr>
-        <w:ind w:leftChars="0"/>
-        <w:jc w:val="left"/>
-        <w:rPr>
-          <w:sz w:val="22"/>
-        </w:rPr>
-      </w:pPr>
-      <w:r>
-        <w:rPr>
-          <w:rFonts w:hint="eastAsia"/>
-          <w:sz w:val="22"/>
-        </w:rPr>
-        <w:t>VFX는 groundSnap, groundAlign, particleCollision, particleConform 속성 설정 가능</w:t>
-      </w:r>
-    </w:p>
-    <w:p>
-      <w:pPr>
-        <w:pStyle w:val="a3"/>
-        <w:numPr>
-          <w:ilvl w:val="3"/>
-          <w:numId w:val="1"/>
-        </w:numPr>
-        <w:ind w:leftChars="0"/>
-        <w:jc w:val="left"/>
-        <w:rPr>
-          <w:sz w:val="22"/>
-        </w:rPr>
-      </w:pPr>
-      <w:r>
-        <w:rPr>
-          <w:rFonts w:hint="eastAsia"/>
-          <w:sz w:val="22"/>
-        </w:rPr>
-        <w:t>groundSnap: VFX를 지표면 위로 강제로 투영</w:t>
-      </w:r>
-    </w:p>
-    <w:p>
-      <w:pPr>
-        <w:pStyle w:val="a3"/>
-        <w:numPr>
-          <w:ilvl w:val="3"/>
-          <w:numId w:val="1"/>
-        </w:numPr>
-        <w:ind w:leftChars="0"/>
-        <w:jc w:val="left"/>
-        <w:rPr>
-          <w:sz w:val="22"/>
-        </w:rPr>
-      </w:pPr>
-      <w:r>
-        <w:rPr>
-          <w:rFonts w:hint="eastAsia"/>
-          <w:sz w:val="22"/>
-        </w:rPr>
-        <w:t>groundAlign: VFX를 지면 노멀에 맞게 회전</w:t>
-      </w:r>
-    </w:p>
-    <w:p>
-      <w:pPr>
-        <w:pStyle w:val="a3"/>
-        <w:numPr>
-          <w:ilvl w:val="3"/>
-          <w:numId w:val="1"/>
-        </w:numPr>
-        <w:ind w:leftChars="0"/>
-        <w:jc w:val="left"/>
-        <w:rPr>
-          <w:sz w:val="22"/>
-        </w:rPr>
-      </w:pPr>
-      <w:r>
-        <w:rPr>
-          <w:rFonts w:hint="eastAsia"/>
-          <w:sz w:val="22"/>
-        </w:rPr>
-        <w:t>particleCollision: 파티클이 지면과 충돌할 시 처리 방식 지정,</w:t>
-      </w:r>
-      <w:r>
-        <w:rPr>
-          <w:sz w:val="22"/>
-        </w:rPr>
-        <w:br/>
-        <w:t>“</w:t>
-      </w:r>
-      <w:r>
-        <w:rPr>
-          <w:rFonts w:hint="eastAsia"/>
-          <w:sz w:val="22"/>
-        </w:rPr>
-        <w:t>GroundStop</w:t>
-      </w:r>
-      <w:r>
-        <w:rPr>
-          <w:sz w:val="22"/>
-        </w:rPr>
-        <w:t>”</w:t>
-      </w:r>
-      <w:r>
-        <w:rPr>
-          <w:rFonts w:hint="eastAsia"/>
-          <w:sz w:val="22"/>
-        </w:rPr>
-        <w:t>/</w:t>
-      </w:r>
-      <w:r>
-        <w:rPr>
-          <w:sz w:val="22"/>
-        </w:rPr>
-        <w:t>”</w:t>
-      </w:r>
-      <w:r>
-        <w:rPr>
-          <w:rFonts w:hint="eastAsia"/>
-          <w:sz w:val="22"/>
-        </w:rPr>
-        <w:t>GroundKill</w:t>
-      </w:r>
-      <w:r>
-        <w:rPr>
-          <w:sz w:val="22"/>
-        </w:rPr>
-        <w:t>”</w:t>
-      </w:r>
-      <w:r>
-        <w:rPr>
-          <w:rFonts w:hint="eastAsia"/>
-          <w:sz w:val="22"/>
-        </w:rPr>
-        <w:t>/</w:t>
-      </w:r>
-      <w:r>
-        <w:rPr>
-          <w:sz w:val="22"/>
-        </w:rPr>
-        <w:t>”</w:t>
-      </w:r>
-      <w:r>
-        <w:rPr>
-          <w:rFonts w:hint="eastAsia"/>
-          <w:sz w:val="22"/>
-        </w:rPr>
-        <w:t>GroundBounce</w:t>
-      </w:r>
-      <w:r>
-        <w:rPr>
-          <w:sz w:val="22"/>
-        </w:rPr>
-        <w:t>”</w:t>
-      </w:r>
-      <w:r>
-        <w:rPr>
-          <w:rFonts w:hint="eastAsia"/>
-          <w:sz w:val="22"/>
-        </w:rPr>
-        <w:t xml:space="preserve"> 중 하나의 값</w:t>
-      </w:r>
-    </w:p>
-    <w:p>
-      <w:pPr>
-        <w:pStyle w:val="a3"/>
-        <w:numPr>
-          <w:ilvl w:val="3"/>
-          <w:numId w:val="1"/>
-        </w:numPr>
-        <w:ind w:leftChars="0"/>
-        <w:jc w:val="left"/>
-        <w:rPr>
-          <w:sz w:val="22"/>
-        </w:rPr>
-      </w:pPr>
-      <w:r>
-        <w:rPr>
-          <w:rFonts w:hint="eastAsia"/>
-          <w:sz w:val="22"/>
-        </w:rPr>
-        <w:t>particleConform: 파티클이 지면과 겹쳐서 스폰될 시 처리 방식 지정,</w:t>
-      </w:r>
-      <w:r>
-        <w:rPr>
-          <w:sz w:val="22"/>
-        </w:rPr>
-        <w:br/>
-        <w:t>“</w:t>
-      </w:r>
-      <w:r>
-        <w:rPr>
-          <w:rFonts w:hint="eastAsia"/>
-          <w:sz w:val="22"/>
-        </w:rPr>
-        <w:t>SnapY</w:t>
-      </w:r>
-      <w:r>
-        <w:rPr>
-          <w:sz w:val="22"/>
-        </w:rPr>
-        <w:t>”</w:t>
-      </w:r>
-      <w:r>
-        <w:rPr>
-          <w:rFonts w:hint="eastAsia"/>
-          <w:sz w:val="22"/>
-        </w:rPr>
-        <w:t>/</w:t>
-      </w:r>
-      <w:r>
-        <w:rPr>
-          <w:sz w:val="22"/>
-        </w:rPr>
-        <w:t>”</w:t>
-      </w:r>
-      <w:r>
-        <w:rPr>
-          <w:rFonts w:hint="eastAsia"/>
-          <w:sz w:val="22"/>
-        </w:rPr>
-        <w:t>SnapAndAlign</w:t>
-      </w:r>
-      <w:r>
-        <w:rPr>
-          <w:sz w:val="22"/>
-        </w:rPr>
-        <w:t>”</w:t>
-      </w:r>
-      <w:r>
-        <w:rPr>
-          <w:rFonts w:hint="eastAsia"/>
-          <w:sz w:val="22"/>
-        </w:rPr>
-        <w:t xml:space="preserve"> 중 하나의 값</w:t>
-      </w:r>
-    </w:p>
-    <w:p>
-      <w:pPr>
-        <w:pStyle w:val="a3"/>
-        <w:numPr>
-          <w:ilvl w:val="2"/>
-          <w:numId w:val="1"/>
-        </w:numPr>
-        <w:ind w:leftChars="0"/>
-        <w:jc w:val="left"/>
-        <w:rPr>
-          <w:sz w:val="22"/>
-        </w:rPr>
-      </w:pPr>
-      <w:r>
-        <w:rPr>
-          <w:rFonts w:hint="eastAsia"/>
-          <w:sz w:val="22"/>
-        </w:rPr>
-        <w:t>Hitbox는 AttachType에 Ground 추가 (</w:t>
-      </w:r>
-      <w:r>
-        <w:rPr>
-          <w:sz w:val="22"/>
-        </w:rPr>
-        <w:t>“</w:t>
-      </w:r>
-      <w:r>
-        <w:rPr>
-          <w:rFonts w:hint="eastAsia"/>
-          <w:sz w:val="22"/>
-        </w:rPr>
-        <w:t>BoneAttach</w:t>
-      </w:r>
-      <w:r>
-        <w:rPr>
-          <w:sz w:val="22"/>
-        </w:rPr>
-        <w:t>”</w:t>
-      </w:r>
-      <w:r>
-        <w:rPr>
-          <w:rFonts w:hint="eastAsia"/>
-          <w:sz w:val="22"/>
-        </w:rPr>
-        <w:t>/</w:t>
-      </w:r>
-      <w:r>
-        <w:rPr>
-          <w:sz w:val="22"/>
-        </w:rPr>
-        <w:t>”</w:t>
-      </w:r>
-      <w:r>
-        <w:rPr>
-          <w:rFonts w:hint="eastAsia"/>
-          <w:sz w:val="22"/>
-        </w:rPr>
-        <w:t>VFXParticleAttach</w:t>
-      </w:r>
-      <w:r>
-        <w:rPr>
-          <w:sz w:val="22"/>
-        </w:rPr>
-        <w:t>”</w:t>
-      </w:r>
-      <w:r>
-        <w:rPr>
-          <w:rFonts w:hint="eastAsia"/>
-          <w:sz w:val="22"/>
-        </w:rPr>
-        <w:t>/</w:t>
-      </w:r>
-      <w:r>
-        <w:rPr>
-          <w:sz w:val="22"/>
-        </w:rPr>
-        <w:t>”</w:t>
-      </w:r>
-      <w:r>
-        <w:rPr>
-          <w:rFonts w:hint="eastAsia"/>
-          <w:sz w:val="22"/>
-        </w:rPr>
-        <w:t>GroundAttach</w:t>
-      </w:r>
-      <w:r>
-        <w:rPr>
-          <w:sz w:val="22"/>
-        </w:rPr>
-        <w:t>”</w:t>
-      </w:r>
-      <w:r>
-        <w:rPr>
-          <w:rFonts w:hint="eastAsia"/>
-          <w:sz w:val="22"/>
-        </w:rPr>
-        <w:t>)</w:t>
-      </w:r>
-      <w:r>
-        <w:rPr>
-          <w:rFonts w:hint="eastAsia"/>
-          <w:sz w:val="22"/>
-        </w:rPr>
-        <w:t>, anchor와 align 속성 설정 가능</w:t>
-      </w:r>
-    </w:p>
-    <w:p>
-      <w:pPr>
-        <w:pStyle w:val="a3"/>
-        <w:numPr>
-          <w:ilvl w:val="3"/>
-          <w:numId w:val="1"/>
-        </w:numPr>
-        <w:ind w:leftChars="0"/>
-        <w:jc w:val="left"/>
-        <w:rPr>
-          <w:sz w:val="22"/>
-        </w:rPr>
-      </w:pPr>
-      <w:r>
-        <w:rPr>
-          <w:rFonts w:hint="eastAsia"/>
-          <w:sz w:val="22"/>
-        </w:rPr>
-        <w:t>anchor: Hitbox가 특정 점 기준 local로 표현되어야 할 때 사용, 이때 anchor를</w:t>
-      </w:r>
-      <w:r>
-        <w:rPr>
-          <w:sz w:val="22"/>
-        </w:rPr>
-        <w:br/>
-      </w:r>
-      <w:r>
-        <w:rPr>
-          <w:rFonts w:hint="eastAsia"/>
-          <w:sz w:val="22"/>
-        </w:rPr>
-        <w:t>지표상 투영된 점으로 지정 가능</w:t>
-      </w:r>
-    </w:p>
-    <w:p>
-      <w:pPr>
-        <w:pStyle w:val="a3"/>
-        <w:numPr>
-          <w:ilvl w:val="3"/>
-          <w:numId w:val="1"/>
-        </w:numPr>
-        <w:ind w:leftChars="0"/>
-        <w:jc w:val="left"/>
-        <w:rPr>
-          <w:sz w:val="22"/>
-        </w:rPr>
-      </w:pPr>
-      <w:r>
-        <w:rPr>
-          <w:rFonts w:hint="eastAsia"/>
-          <w:sz w:val="22"/>
-        </w:rPr>
-        <w:t>align: Hitbox가 지면에 겹칠 경우 지면 노멀에 맞게 회전</w:t>
-      </w:r>
-    </w:p>
-    <w:p>
-      <w:pPr>
-        <w:pStyle w:val="a3"/>
-        <w:numPr>
-          <w:ilvl w:val="1"/>
-          <w:numId w:val="1"/>
-        </w:numPr>
-        <w:ind w:leftChars="0"/>
-        <w:jc w:val="left"/>
-        <w:rPr>
-          <w:sz w:val="22"/>
-        </w:rPr>
-      </w:pPr>
-      <w:r>
-        <w:rPr>
-          <w:rFonts w:hint="eastAsia"/>
-          <w:sz w:val="22"/>
-        </w:rPr>
-        <w:t>무기별 4종류 스킬 제작 완료</w:t>
-      </w:r>
-    </w:p>
-    <w:p>
-      <w:pPr>
-        <w:pStyle w:val="a3"/>
-        <w:numPr>
-          <w:ilvl w:val="2"/>
-          <w:numId w:val="1"/>
-        </w:numPr>
-        <w:ind w:leftChars="0"/>
-        <w:jc w:val="left"/>
-        <w:rPr>
-          <w:sz w:val="22"/>
-        </w:rPr>
-      </w:pPr>
-      <w:r>
-        <w:rPr>
-          <w:rFonts w:hint="eastAsia"/>
-          <w:sz w:val="22"/>
-        </w:rPr>
-        <w:t>아직 온라인 모드 스킬 시스템에 등록되지 않음, 통합 필요</w:t>
-      </w:r>
-    </w:p>
-    <w:p>
-      <w:pPr>
-        <w:pStyle w:val="a3"/>
-        <w:numPr>
-          <w:ilvl w:val="0"/>
-          <w:numId w:val="1"/>
-        </w:numPr>
-        <w:ind w:leftChars="0"/>
-        <w:jc w:val="left"/>
-        <w:rPr>
-          <w:sz w:val="22"/>
-        </w:rPr>
-      </w:pPr>
-      <w:r>
-        <w:rPr>
           <w:sz w:val="22"/>
         </w:rPr>
         <w:br w:type="page"/>
@@ -1490,7 +1354,6 @@
         <w:ind w:leftChars="200" w:left="400"/>
         <w:jc w:val="left"/>
         <w:rPr>
-          <w:rFonts w:hint="eastAsia"/>
           <w:b/>
           <w:bCs/>
           <w:sz w:val="18"/>
@@ -1516,6 +1379,7 @@
         </w:rPr>
         <w:t xml:space="preserve">. </w:t>
       </w:r>
+      <w:proofErr w:type="spellStart"/>
       <w:r>
         <w:rPr>
           <w:rFonts w:hint="eastAsia"/>
@@ -1524,7 +1388,18 @@
           <w:sz w:val="18"/>
           <w:szCs w:val="20"/>
         </w:rPr>
-        <w:t>파티원 HP UI 추가</w:t>
+        <w:t>파티원</w:t>
+      </w:r>
+      <w:proofErr w:type="spellEnd"/>
+      <w:r>
+        <w:rPr>
+          <w:rFonts w:hint="eastAsia"/>
+          <w:b/>
+          <w:bCs/>
+          <w:sz w:val="18"/>
+          <w:szCs w:val="20"/>
+        </w:rPr>
+        <w:t xml:space="preserve"> HP UI 추가</w:t>
       </w:r>
     </w:p>
     <w:p>
@@ -1673,7 +1548,6 @@
         <w:ind w:leftChars="200" w:left="400"/>
         <w:jc w:val="left"/>
         <w:rPr>
-          <w:rFonts w:hint="eastAsia"/>
           <w:b/>
           <w:bCs/>
           <w:sz w:val="18"/>
@@ -1848,7 +1722,29 @@
           <w:sz w:val="18"/>
           <w:szCs w:val="20"/>
         </w:rPr>
-        <w:t>대기실 캐릭터 종횡비 왜곡 수정</w:t>
+        <w:t xml:space="preserve">대기실 캐릭터 </w:t>
+      </w:r>
+      <w:proofErr w:type="spellStart"/>
+      <w:r>
+        <w:rPr>
+          <w:rFonts w:hint="eastAsia"/>
+          <w:b/>
+          <w:bCs/>
+          <w:sz w:val="18"/>
+          <w:szCs w:val="20"/>
+        </w:rPr>
+        <w:t>종횡비</w:t>
+      </w:r>
+      <w:proofErr w:type="spellEnd"/>
+      <w:r>
+        <w:rPr>
+          <w:rFonts w:hint="eastAsia"/>
+          <w:b/>
+          <w:bCs/>
+          <w:sz w:val="18"/>
+          <w:szCs w:val="20"/>
+        </w:rPr>
+        <w:t xml:space="preserve"> 왜곡 수정</w:t>
       </w:r>
     </w:p>
     <w:p>
@@ -1934,13 +1830,23 @@
         </w:rPr>
         <w:t xml:space="preserve">NPC </w:t>
       </w:r>
+      <w:proofErr w:type="spellStart"/>
       <w:r>
         <w:rPr>
           <w:rFonts w:hint="eastAsia"/>
           <w:b/>
           <w:bCs/>
         </w:rPr>
-        <w:t>분리력 계산 최적화</w:t>
+        <w:t>분리력</w:t>
+      </w:r>
+      <w:proofErr w:type="spellEnd"/>
+      <w:r>
+        <w:rPr>
+          <w:rFonts w:hint="eastAsia"/>
+          <w:b/>
+          <w:bCs/>
+        </w:rPr>
+        <w:t xml:space="preserve"> 계산 최적화</w:t>
       </w:r>
     </w:p>
     <w:p>
@@ -1965,7 +1871,21 @@
         <w:rPr>
           <w:rFonts w:hint="eastAsia"/>
         </w:rPr>
-        <w:t xml:space="preserve">가 분리력을 계산할 때 주변 </w:t>
+        <w:t xml:space="preserve">가 </w:t>
+      </w:r>
+      <w:proofErr w:type="spellStart"/>
+      <w:r>
+        <w:rPr>
+          <w:rFonts w:hint="eastAsia"/>
+        </w:rPr>
+        <w:t>분리력을</w:t>
+      </w:r>
+      <w:proofErr w:type="spellEnd"/>
+      <w:r>
+        <w:rPr>
+          <w:rFonts w:hint="eastAsia"/>
+        </w:rPr>
+        <w:t xml:space="preserve"> 계산할 때 주변 </w:t>
       </w:r>
       <w:r>
         <w:t>NPC</w:t>
@@ -2044,7 +1964,21 @@
         <w:rPr>
           <w:rFonts w:hint="eastAsia"/>
         </w:rPr>
-        <w:t>만 분리력 계산 후보로 선별하고,</w:t>
+        <w:t xml:space="preserve">만 </w:t>
+      </w:r>
+      <w:proofErr w:type="spellStart"/>
+      <w:r>
+        <w:rPr>
+          <w:rFonts w:hint="eastAsia"/>
+        </w:rPr>
+        <w:t>분리력</w:t>
+      </w:r>
+      <w:proofErr w:type="spellEnd"/>
+      <w:r>
+        <w:rPr>
+          <w:rFonts w:hint="eastAsia"/>
+        </w:rPr>
+        <w:t xml:space="preserve"> 계산 후보로 선별하고,</w:t>
       </w:r>
       <w:r>
         <w:br/>
@@ -2101,14 +2035,33 @@
         </w:rPr>
         <w:t xml:space="preserve">기존 </w:t>
       </w:r>
-      <w:r>
-        <w:t xml:space="preserve">findNearbyNpcPositions </w:t>
-      </w:r>
-      <w:r>
-        <w:rPr>
-          <w:rFonts w:hint="eastAsia"/>
-        </w:rPr>
-        <w:t>함수는 시그니처를 유지한 채 내부 구현만 인접 리스트 조회</w:t>
+      <w:proofErr w:type="spellStart"/>
+      <w:r>
+        <w:t>findNearbyNpcPositions</w:t>
+      </w:r>
+      <w:proofErr w:type="spellEnd"/>
+      <w:r>
+        <w:t xml:space="preserve"> </w:t>
+      </w:r>
+      <w:r>
+        <w:rPr>
+          <w:rFonts w:hint="eastAsia"/>
+        </w:rPr>
+        <w:t xml:space="preserve">함수는 </w:t>
+      </w:r>
+      <w:proofErr w:type="spellStart"/>
+      <w:r>
+        <w:rPr>
+          <w:rFonts w:hint="eastAsia"/>
+        </w:rPr>
+        <w:t>시그니처를</w:t>
+      </w:r>
+      <w:proofErr w:type="spellEnd"/>
+      <w:r>
+        <w:rPr>
+          <w:rFonts w:hint="eastAsia"/>
+        </w:rPr>
+        <w:t xml:space="preserve"> 유지한 채 내부 구현만 인접 리스트 조회</w:t>
       </w:r>
       <w:r>
         <w:br/>
@@ -2135,18 +2088,22 @@
         </w:rPr>
         <w:t xml:space="preserve">이로 인해 </w:t>
       </w:r>
+      <w:proofErr w:type="spellStart"/>
       <w:r>
         <w:t>TacticalNpc</w:t>
       </w:r>
+      <w:proofErr w:type="spellEnd"/>
       <w:r>
         <w:rPr>
           <w:rFonts w:hint="eastAsia"/>
         </w:rPr>
         <w:t xml:space="preserve">와 </w:t>
       </w:r>
+      <w:proofErr w:type="spellStart"/>
       <w:r>
         <w:t>Npc</w:t>
       </w:r>
+      <w:proofErr w:type="spellEnd"/>
       <w:r>
         <w:rPr>
           <w:rFonts w:hint="eastAsia"/>
@@ -2205,7 +2162,23 @@
           <w:rFonts w:hint="eastAsia"/>
           <w:b/>
         </w:rPr>
-        <w:t>전술 전투 동적 스폰 트리거 연결</w:t>
+        <w:t xml:space="preserve">전술 전투 동적 </w:t>
+      </w:r>
+      <w:proofErr w:type="spellStart"/>
+      <w:r>
+        <w:rPr>
+          <w:rFonts w:hint="eastAsia"/>
+          <w:b/>
+        </w:rPr>
+        <w:t>스폰</w:t>
+      </w:r>
+      <w:proofErr w:type="spellEnd"/>
+      <w:r>
+        <w:rPr>
+          <w:rFonts w:hint="eastAsia"/>
+          <w:b/>
+        </w:rPr>
+        <w:t xml:space="preserve"> 트리거 연결</w:t>
       </w:r>
     </w:p>
     <w:p>
@@ -2223,23 +2196,44 @@
         </w:rPr>
         <w:t xml:space="preserve">플레이어가 </w:t>
       </w:r>
-      <w:r>
-        <w:t xml:space="preserve">Arena_Hobgoblin </w:t>
-      </w:r>
-      <w:r>
-        <w:rPr>
-          <w:rFonts w:hint="eastAsia"/>
-        </w:rPr>
-        <w:t>존에 진입하면 중간보스와 전술 분대가 동적으로</w:t>
+      <w:proofErr w:type="spellStart"/>
+      <w:r>
+        <w:t>Arena_Hobgoblin</w:t>
+      </w:r>
+      <w:proofErr w:type="spellEnd"/>
+      <w:r>
+        <w:t xml:space="preserve"> </w:t>
+      </w:r>
+      <w:proofErr w:type="spellStart"/>
+      <w:r>
+        <w:rPr>
+          <w:rFonts w:hint="eastAsia"/>
+        </w:rPr>
+        <w:t>존에</w:t>
+      </w:r>
+      <w:proofErr w:type="spellEnd"/>
+      <w:r>
+        <w:rPr>
+          <w:rFonts w:hint="eastAsia"/>
+        </w:rPr>
+        <w:t xml:space="preserve"> 진입하면 중간보스와 전술 분대가 동적으로</w:t>
       </w:r>
       <w:r>
         <w:br/>
       </w:r>
-      <w:r>
-        <w:rPr>
-          <w:rFonts w:hint="eastAsia"/>
-        </w:rPr>
-        <w:t>스폰되도록 트리거를 연결했다.</w:t>
+      <w:proofErr w:type="spellStart"/>
+      <w:r>
+        <w:rPr>
+          <w:rFonts w:hint="eastAsia"/>
+        </w:rPr>
+        <w:t>스폰되도록</w:t>
+      </w:r>
+      <w:proofErr w:type="spellEnd"/>
+      <w:r>
+        <w:rPr>
+          <w:rFonts w:hint="eastAsia"/>
+        </w:rPr>
+        <w:t xml:space="preserve"> 트리거를 연결했다.</w:t>
       </w:r>
       <w:r>
         <w:br/>
@@ -2290,19 +2284,23 @@
       <w:r>
         <w:t>Room::</w:t>
       </w:r>
+      <w:proofErr w:type="spellStart"/>
       <w:proofErr w:type="gramEnd"/>
       <w:r>
         <w:t>onArenaHobgoblinEnter</w:t>
       </w:r>
+      <w:proofErr w:type="spellEnd"/>
       <w:r>
         <w:rPr>
           <w:rFonts w:hint="eastAsia"/>
         </w:rPr>
         <w:t xml:space="preserve">에서 </w:t>
       </w:r>
+      <w:proofErr w:type="spellStart"/>
       <w:r>
         <w:t>spawnTacticalGoblinEncounter</w:t>
       </w:r>
+      <w:proofErr w:type="spellEnd"/>
       <w:r>
         <w:rPr>
           <w:rFonts w:hint="eastAsia"/>
@@ -2341,12 +2339,21 @@
         </w:rPr>
         <w:t xml:space="preserve">NPC </w:t>
       </w:r>
+      <w:proofErr w:type="spellStart"/>
       <w:r>
         <w:rPr>
           <w:rFonts w:hint="eastAsia"/>
           <w:b/>
         </w:rPr>
-        <w:t>스폰 패킷 추가</w:t>
+        <w:t>스폰</w:t>
+      </w:r>
+      <w:proofErr w:type="spellEnd"/>
+      <w:r>
+        <w:rPr>
+          <w:rFonts w:hint="eastAsia"/>
+          <w:b/>
+        </w:rPr>
+        <w:t xml:space="preserve"> 패킷 추가</w:t>
       </w:r>
     </w:p>
     <w:p>
@@ -2364,8 +2371,13 @@
         </w:rPr>
         <w:t xml:space="preserve">기존 클라이언트는 방 입장 시점의 </w:t>
       </w:r>
-      <w:r>
-        <w:t xml:space="preserve">S_Enter </w:t>
+      <w:proofErr w:type="spellStart"/>
+      <w:r>
+        <w:t>S_Enter</w:t>
+      </w:r>
+      <w:proofErr w:type="spellEnd"/>
+      <w:r>
+        <w:t xml:space="preserve"> </w:t>
       </w:r>
       <w:r>
         <w:rPr>
@@ -2416,8 +2428,13 @@
         </w:rPr>
         <w:t xml:space="preserve">이를 해결하기 위해 </w:t>
       </w:r>
-      <w:r>
-        <w:t xml:space="preserve">S_NpcSpawnBatch </w:t>
+      <w:proofErr w:type="spellStart"/>
+      <w:r>
+        <w:t>S_NpcSpawnBatch</w:t>
+      </w:r>
+      <w:proofErr w:type="spellEnd"/>
+      <w:r>
+        <w:t xml:space="preserve"> </w:t>
       </w:r>
       <w:r>
         <w:rPr>
@@ -2426,7 +2443,15 @@
         <w:t>패킷을 추가하고,</w:t>
       </w:r>
       <w:r>
-        <w:t xml:space="preserve"> ObjectInfo </w:t>
+        <w:t xml:space="preserve"> </w:t>
+      </w:r>
+      <w:proofErr w:type="spellStart"/>
+      <w:r>
+        <w:t>ObjectInfo</w:t>
+      </w:r>
+      <w:proofErr w:type="spellEnd"/>
+      <w:r>
+        <w:t xml:space="preserve"> </w:t>
       </w:r>
       <w:r>
         <w:rPr>
@@ -2480,7 +2505,21 @@
         <w:rPr>
           <w:rFonts w:hint="eastAsia"/>
         </w:rPr>
-        <w:t xml:space="preserve">의 초기 스냅샷에도 이미 스폰된 전술 </w:t>
+        <w:t xml:space="preserve">의 초기 스냅샷에도 이미 </w:t>
+      </w:r>
+      <w:proofErr w:type="spellStart"/>
+      <w:r>
+        <w:rPr>
+          <w:rFonts w:hint="eastAsia"/>
+        </w:rPr>
+        <w:t>스폰된</w:t>
+      </w:r>
+      <w:proofErr w:type="spellEnd"/>
+      <w:r>
+        <w:rPr>
+          <w:rFonts w:hint="eastAsia"/>
+        </w:rPr>
+        <w:t xml:space="preserve"> 전술 </w:t>
       </w:r>
       <w:r>
         <w:t>NPC</w:t>
@@ -2637,7 +2676,21 @@
         <w:rPr>
           <w:rFonts w:hint="eastAsia"/>
         </w:rPr>
-        <w:t>명령이 같은 틱에 하위 객체까지 전파되도록 수정했다.</w:t>
+        <w:t xml:space="preserve">명령이 같은 </w:t>
+      </w:r>
+      <w:proofErr w:type="spellStart"/>
+      <w:r>
+        <w:rPr>
+          <w:rFonts w:hint="eastAsia"/>
+        </w:rPr>
+        <w:t>틱에</w:t>
+      </w:r>
+      <w:proofErr w:type="spellEnd"/>
+      <w:r>
+        <w:rPr>
+          <w:rFonts w:hint="eastAsia"/>
+        </w:rPr>
+        <w:t xml:space="preserve"> 하위 객체까지 전파되도록 수정했다.</w:t>
       </w:r>
     </w:p>
     <w:p>
@@ -2653,7 +2706,21 @@
         <w:rPr>
           <w:rFonts w:hint="eastAsia"/>
         </w:rPr>
-        <w:t xml:space="preserve">또한 실제 맵의 지형 높낮이 때문에 </w:t>
+        <w:t xml:space="preserve">또한 실제 </w:t>
+      </w:r>
+      <w:proofErr w:type="spellStart"/>
+      <w:r>
+        <w:rPr>
+          <w:rFonts w:hint="eastAsia"/>
+        </w:rPr>
+        <w:t>맵의</w:t>
+      </w:r>
+      <w:proofErr w:type="spellEnd"/>
+      <w:r>
+        <w:rPr>
+          <w:rFonts w:hint="eastAsia"/>
+        </w:rPr>
+        <w:t xml:space="preserve"> 지형 높낮이 때문에 </w:t>
       </w:r>
       <w:r>
         <w:t xml:space="preserve">3D </w:t>
@@ -2761,7 +2828,21 @@
         <w:rPr>
           <w:rFonts w:hint="eastAsia"/>
         </w:rPr>
-        <w:t xml:space="preserve">좌우 차단선 </w:t>
+        <w:t xml:space="preserve">좌우 </w:t>
+      </w:r>
+      <w:proofErr w:type="spellStart"/>
+      <w:r>
+        <w:rPr>
+          <w:rFonts w:hint="eastAsia"/>
+        </w:rPr>
+        <w:t>차단선</w:t>
+      </w:r>
+      <w:proofErr w:type="spellEnd"/>
+      <w:r>
+        <w:rPr>
+          <w:rFonts w:hint="eastAsia"/>
+        </w:rPr>
+        <w:t xml:space="preserve"> </w:t>
       </w:r>
       <w:r>
         <w:t>NPC</w:t>
@@ -2788,7 +2869,21 @@
         <w:rPr>
           <w:rFonts w:hint="eastAsia"/>
         </w:rPr>
-        <w:t xml:space="preserve">하지만 초기에는 차단선 </w:t>
+        <w:t xml:space="preserve">하지만 초기에는 </w:t>
+      </w:r>
+      <w:proofErr w:type="spellStart"/>
+      <w:r>
+        <w:rPr>
+          <w:rFonts w:hint="eastAsia"/>
+        </w:rPr>
+        <w:t>차단선</w:t>
+      </w:r>
+      <w:proofErr w:type="spellEnd"/>
+      <w:r>
+        <w:rPr>
+          <w:rFonts w:hint="eastAsia"/>
+        </w:rPr>
+        <w:t xml:space="preserve"> </w:t>
       </w:r>
       <w:r>
         <w:t>NPC</w:t>
@@ -2815,7 +2910,21 @@
         <w:rPr>
           <w:rFonts w:hint="eastAsia"/>
         </w:rPr>
-        <w:t xml:space="preserve">서버에서 차단선 </w:t>
+        <w:t xml:space="preserve">서버에서 </w:t>
+      </w:r>
+      <w:proofErr w:type="spellStart"/>
+      <w:r>
+        <w:rPr>
+          <w:rFonts w:hint="eastAsia"/>
+        </w:rPr>
+        <w:t>차단선</w:t>
+      </w:r>
+      <w:proofErr w:type="spellEnd"/>
+      <w:r>
+        <w:rPr>
+          <w:rFonts w:hint="eastAsia"/>
+        </w:rPr>
+        <w:t xml:space="preserve"> </w:t>
       </w:r>
       <w:r>
         <w:t>NPC</w:t>
@@ -2835,8 +2944,13 @@
         </w:rPr>
         <w:t xml:space="preserve">상태를 클라이언트에 전달하는 </w:t>
       </w:r>
-      <w:r>
-        <w:t xml:space="preserve">S_NpcBarrier </w:t>
+      <w:proofErr w:type="spellStart"/>
+      <w:r>
+        <w:t>S_NpcBarrier</w:t>
+      </w:r>
+      <w:proofErr w:type="spellEnd"/>
+      <w:r>
+        <w:t xml:space="preserve"> </w:t>
       </w:r>
       <w:r>
         <w:rPr>
@@ -2906,7 +3020,21 @@
         <w:rPr>
           <w:rFonts w:hint="eastAsia"/>
         </w:rPr>
-        <w:t>물리 솔버를 사용하지 않고 위치 기반으로 분리했기 때문에</w:t>
+        <w:t xml:space="preserve">물리 </w:t>
+      </w:r>
+      <w:proofErr w:type="spellStart"/>
+      <w:r>
+        <w:rPr>
+          <w:rFonts w:hint="eastAsia"/>
+        </w:rPr>
+        <w:t>솔버를</w:t>
+      </w:r>
+      <w:proofErr w:type="spellEnd"/>
+      <w:r>
+        <w:rPr>
+          <w:rFonts w:hint="eastAsia"/>
+        </w:rPr>
+        <w:t xml:space="preserve"> 사용하지 않고 위치 기반으로 분리했기 때문에</w:t>
       </w:r>
       <w:r>
         <w:br/>
@@ -2994,7 +3122,21 @@
         <w:rPr>
           <w:rFonts w:hint="eastAsia"/>
         </w:rPr>
-        <w:t xml:space="preserve">플레이어가 차단선 </w:t>
+        <w:t xml:space="preserve">플레이어가 </w:t>
+      </w:r>
+      <w:proofErr w:type="spellStart"/>
+      <w:r>
+        <w:rPr>
+          <w:rFonts w:hint="eastAsia"/>
+        </w:rPr>
+        <w:t>차단선</w:t>
+      </w:r>
+      <w:proofErr w:type="spellEnd"/>
+      <w:r>
+        <w:rPr>
+          <w:rFonts w:hint="eastAsia"/>
+        </w:rPr>
+        <w:t xml:space="preserve"> </w:t>
       </w:r>
       <w:r>
         <w:t>NPC</w:t>
@@ -3140,7 +3282,21 @@
         <w:rPr>
           <w:rFonts w:hint="eastAsia"/>
         </w:rPr>
-        <w:t xml:space="preserve">이를 거리 기반 우선순위와 재예약 제한 조건 기반으로 변경하여 가까운 </w:t>
+        <w:t xml:space="preserve">이를 거리 기반 우선순위와 </w:t>
+      </w:r>
+      <w:proofErr w:type="spellStart"/>
+      <w:r>
+        <w:rPr>
+          <w:rFonts w:hint="eastAsia"/>
+        </w:rPr>
+        <w:t>재예약</w:t>
+      </w:r>
+      <w:proofErr w:type="spellEnd"/>
+      <w:r>
+        <w:rPr>
+          <w:rFonts w:hint="eastAsia"/>
+        </w:rPr>
+        <w:t xml:space="preserve"> 제한 조건 기반으로 변경하여 가까운 </w:t>
       </w:r>
       <w:r>
         <w:t>NPC</w:t>
@@ -3210,7 +3366,21 @@
         <w:rPr>
           <w:rFonts w:hint="eastAsia"/>
         </w:rPr>
-        <w:t>분대 명령이 매 틱 흔들리거나</w:t>
+        <w:t xml:space="preserve">분대 명령이 매 </w:t>
+      </w:r>
+      <w:proofErr w:type="spellStart"/>
+      <w:r>
+        <w:rPr>
+          <w:rFonts w:hint="eastAsia"/>
+        </w:rPr>
+        <w:t>틱</w:t>
+      </w:r>
+      <w:proofErr w:type="spellEnd"/>
+      <w:r>
+        <w:rPr>
+          <w:rFonts w:hint="eastAsia"/>
+        </w:rPr>
+        <w:t xml:space="preserve"> 흔들리거나</w:t>
       </w:r>
       <w:r>
         <w:br/>
@@ -3581,6 +3751,7 @@
               </w:rPr>
               <w:t xml:space="preserve">나무/풀 그림자 포함 제대로 렌더링, Skill Cooldown UI 추가, </w:t>
             </w:r>
+            <w:proofErr w:type="spellStart"/>
             <w:r>
               <w:rPr>
                 <w:rFonts w:hint="eastAsia"/>
@@ -3588,7 +3759,17 @@
                 <w:bCs/>
                 <w:szCs w:val="20"/>
               </w:rPr>
-              <w:t>네비메시 추출</w:t>
+              <w:t>네비메시</w:t>
+            </w:r>
+            <w:proofErr w:type="spellEnd"/>
+            <w:r>
+              <w:rPr>
+                <w:rFonts w:hint="eastAsia"/>
+                <w:b/>
+                <w:bCs/>
+                <w:szCs w:val="20"/>
+              </w:rPr>
+              <w:t xml:space="preserve"> 추출</w:t>
             </w:r>
             <w:r>
               <w:rPr>
@@ -4575,6 +4756,7 @@
   <w:style w:type="character" w:default="1" w:styleId="a0">
     <w:name w:val="Default Paragraph Font"/>
     <w:uiPriority w:val="1"/>
+    <w:semiHidden/>
     <w:unhideWhenUsed/>
   </w:style>
   <w:style w:type="table" w:default="1" w:styleId="a1">

</xml_diff>